<commit_message>
Rewrite the printing instructions for the all-A4 layouts
The old sheet was wrong in almost every detail once everything moved to A4:
it still said favours and pegging print on A5, place cards on A6, and gave 39
sheets. It is now 20 sheets, all A4.

The 'what to print' table now says what each sheet gives you and what to do
with it afterwards, rather than listing paper sizes that no longer vary.
Cutting is written as numbered steps, because two of the six now need cutting
twice - halve the sheet, then trim each half to the line.

PDF not regenerated: Word automation is still hung on this machine.

Co-Authored-By: Claude Opus 5 (1M context) <noreply@anthropic.com>
</commit_message>
<xml_diff>
--- a/print/printing-instructions.docx
+++ b/print/printing-instructions.docx
@@ -47,12 +47,12 @@
           <w:color w:val="2C5D63"/>
           <w:sz w:val="22"/>
         </w:rPr>
-        <w:t>Six documents, 39 sheets in total. Two of them need trimming; the rest print and go straight into a frame.</w:t>
+        <w:t>Six documents, 20 sheets, all on A4. Some sheets carry more than one item and get cut up afterwards.</w:t>
       </w:r>
     </w:p>
     <w:p>
       <w:pPr>
-        <w:spacing w:before="80" w:after="120"/>
+        <w:spacing w:before="80" w:after="100"/>
         <w:jc w:val="left"/>
       </w:pPr>
       <w:r>
@@ -84,7 +84,7 @@
     </w:p>
     <w:p>
       <w:pPr>
-        <w:spacing w:before="0" w:after="120"/>
+        <w:spacing w:before="0" w:after="100"/>
         <w:jc w:val="left"/>
       </w:pPr>
       <w:r>
@@ -116,7 +116,7 @@
     </w:p>
     <w:p>
       <w:pPr>
-        <w:spacing w:before="180" w:after="120"/>
+        <w:spacing w:before="180" w:after="100"/>
         <w:jc w:val="left"/>
       </w:pPr>
       <w:r>
@@ -145,7 +145,7 @@
       <w:tr>
         <w:tc>
           <w:tcPr>
-            <w:tcW w:type="dxa" w:w="2948"/>
+            <w:tcW w:type="dxa" w:w="2154"/>
           </w:tcPr>
           <w:p>
             <w:pPr>
@@ -164,7 +164,7 @@
         </w:tc>
         <w:tc>
           <w:tcPr>
-            <w:tcW w:type="dxa" w:w="1134"/>
+            <w:tcW w:type="dxa" w:w="1020"/>
           </w:tcPr>
           <w:p>
             <w:pPr>
@@ -183,7 +183,7 @@
         </w:tc>
         <w:tc>
           <w:tcPr>
-            <w:tcW w:type="dxa" w:w="2268"/>
+            <w:tcW w:type="dxa" w:w="2154"/>
           </w:tcPr>
           <w:p>
             <w:pPr>
@@ -196,13 +196,13 @@
                 <w:color w:val="2C5D63"/>
                 <w:sz w:val="20"/>
               </w:rPr>
-              <w:t>Paper</w:t>
+              <w:t>You get</w:t>
             </w:r>
           </w:p>
         </w:tc>
         <w:tc>
           <w:tcPr>
-            <w:tcW w:type="dxa" w:w="3061"/>
+            <w:tcW w:type="dxa" w:w="4082"/>
           </w:tcPr>
           <w:p>
             <w:pPr>
@@ -215,7 +215,7 @@
                 <w:color w:val="2C5D63"/>
                 <w:sz w:val="20"/>
               </w:rPr>
-              <w:t>Cut?</w:t>
+              <w:t>Then</w:t>
             </w:r>
           </w:p>
         </w:tc>
@@ -223,7 +223,7 @@
       <w:tr>
         <w:tc>
           <w:tcPr>
-            <w:tcW w:type="dxa" w:w="2948"/>
+            <w:tcW w:type="dxa" w:w="2154"/>
           </w:tcPr>
           <w:p>
             <w:pPr>
@@ -242,7 +242,7 @@
         </w:tc>
         <w:tc>
           <w:tcPr>
-            <w:tcW w:type="dxa" w:w="1134"/>
+            <w:tcW w:type="dxa" w:w="1020"/>
           </w:tcPr>
           <w:p>
             <w:pPr>
@@ -261,7 +261,7 @@
         </w:tc>
         <w:tc>
           <w:tcPr>
-            <w:tcW w:type="dxa" w:w="2268"/>
+            <w:tcW w:type="dxa" w:w="2154"/>
           </w:tcPr>
           <w:p>
             <w:pPr>
@@ -274,13 +274,13 @@
                 <w:color w:val="222D2A"/>
                 <w:sz w:val="20"/>
               </w:rPr>
-              <w:t>A4, landscape</w:t>
+              <w:t>9 table cards</w:t>
             </w:r>
           </w:p>
         </w:tc>
         <w:tc>
           <w:tcPr>
-            <w:tcW w:type="dxa" w:w="3061"/>
+            <w:tcW w:type="dxa" w:w="4082"/>
           </w:tcPr>
           <w:p>
             <w:pPr>
@@ -293,7 +293,7 @@
                 <w:color w:val="222D2A"/>
                 <w:sz w:val="20"/>
               </w:rPr>
-              <w:t>No</w:t>
+              <w:t>Nothing — frame as they are</w:t>
             </w:r>
           </w:p>
         </w:tc>
@@ -301,7 +301,7 @@
       <w:tr>
         <w:tc>
           <w:tcPr>
-            <w:tcW w:type="dxa" w:w="2948"/>
+            <w:tcW w:type="dxa" w:w="2154"/>
           </w:tcPr>
           <w:p>
             <w:pPr>
@@ -320,7 +320,7 @@
         </w:tc>
         <w:tc>
           <w:tcPr>
-            <w:tcW w:type="dxa" w:w="1134"/>
+            <w:tcW w:type="dxa" w:w="1020"/>
           </w:tcPr>
           <w:p>
             <w:pPr>
@@ -339,7 +339,7 @@
         </w:tc>
         <w:tc>
           <w:tcPr>
-            <w:tcW w:type="dxa" w:w="2268"/>
+            <w:tcW w:type="dxa" w:w="2154"/>
           </w:tcPr>
           <w:p>
             <w:pPr>
@@ -352,13 +352,13 @@
                 <w:color w:val="222D2A"/>
                 <w:sz w:val="20"/>
               </w:rPr>
-              <w:t>A4, portrait</w:t>
+              <w:t>1 sign</w:t>
             </w:r>
           </w:p>
         </w:tc>
         <w:tc>
           <w:tcPr>
-            <w:tcW w:type="dxa" w:w="3061"/>
+            <w:tcW w:type="dxa" w:w="4082"/>
           </w:tcPr>
           <w:p>
             <w:pPr>
@@ -371,7 +371,7 @@
                 <w:color w:val="222D2A"/>
                 <w:sz w:val="20"/>
               </w:rPr>
-              <w:t>No</w:t>
+              <w:t>Nothing — frame as it is</w:t>
             </w:r>
           </w:p>
         </w:tc>
@@ -379,7 +379,7 @@
       <w:tr>
         <w:tc>
           <w:tcPr>
-            <w:tcW w:type="dxa" w:w="2948"/>
+            <w:tcW w:type="dxa" w:w="2154"/>
           </w:tcPr>
           <w:p>
             <w:pPr>
@@ -398,7 +398,7 @@
         </w:tc>
         <w:tc>
           <w:tcPr>
-            <w:tcW w:type="dxa" w:w="1134"/>
+            <w:tcW w:type="dxa" w:w="1020"/>
           </w:tcPr>
           <w:p>
             <w:pPr>
@@ -417,7 +417,7 @@
         </w:tc>
         <w:tc>
           <w:tcPr>
-            <w:tcW w:type="dxa" w:w="2268"/>
+            <w:tcW w:type="dxa" w:w="2154"/>
           </w:tcPr>
           <w:p>
             <w:pPr>
@@ -430,13 +430,13 @@
                 <w:color w:val="222D2A"/>
                 <w:sz w:val="20"/>
               </w:rPr>
-              <w:t>A4, portrait</w:t>
+              <w:t>1 sign</w:t>
             </w:r>
           </w:p>
         </w:tc>
         <w:tc>
           <w:tcPr>
-            <w:tcW w:type="dxa" w:w="3061"/>
+            <w:tcW w:type="dxa" w:w="4082"/>
           </w:tcPr>
           <w:p>
             <w:pPr>
@@ -449,7 +449,7 @@
                 <w:color w:val="222D2A"/>
                 <w:sz w:val="20"/>
               </w:rPr>
-              <w:t>No</w:t>
+              <w:t>Nothing — frame as it is</w:t>
             </w:r>
           </w:p>
         </w:tc>
@@ -457,7 +457,7 @@
       <w:tr>
         <w:tc>
           <w:tcPr>
-            <w:tcW w:type="dxa" w:w="2948"/>
+            <w:tcW w:type="dxa" w:w="2154"/>
           </w:tcPr>
           <w:p>
             <w:pPr>
@@ -476,7 +476,7 @@
         </w:tc>
         <w:tc>
           <w:tcPr>
-            <w:tcW w:type="dxa" w:w="1134"/>
+            <w:tcW w:type="dxa" w:w="1020"/>
           </w:tcPr>
           <w:p>
             <w:pPr>
@@ -495,7 +495,7 @@
         </w:tc>
         <w:tc>
           <w:tcPr>
-            <w:tcW w:type="dxa" w:w="2268"/>
+            <w:tcW w:type="dxa" w:w="2154"/>
           </w:tcPr>
           <w:p>
             <w:pPr>
@@ -508,13 +508,13 @@
                 <w:color w:val="222D2A"/>
                 <w:sz w:val="20"/>
               </w:rPr>
-              <w:t>A5, portrait</w:t>
+              <w:t>2 copies</w:t>
             </w:r>
           </w:p>
         </w:tc>
         <w:tc>
           <w:tcPr>
-            <w:tcW w:type="dxa" w:w="3061"/>
+            <w:tcW w:type="dxa" w:w="4082"/>
           </w:tcPr>
           <w:p>
             <w:pPr>
@@ -527,7 +527,7 @@
                 <w:color w:val="222D2A"/>
                 <w:sz w:val="20"/>
               </w:rPr>
-              <w:t>Yes — see below</w:t>
+              <w:t>Cut in half, trim each</w:t>
             </w:r>
           </w:p>
         </w:tc>
@@ -535,7 +535,7 @@
       <w:tr>
         <w:tc>
           <w:tcPr>
-            <w:tcW w:type="dxa" w:w="2948"/>
+            <w:tcW w:type="dxa" w:w="2154"/>
           </w:tcPr>
           <w:p>
             <w:pPr>
@@ -554,7 +554,7 @@
         </w:tc>
         <w:tc>
           <w:tcPr>
-            <w:tcW w:type="dxa" w:w="1134"/>
+            <w:tcW w:type="dxa" w:w="1020"/>
           </w:tcPr>
           <w:p>
             <w:pPr>
@@ -573,7 +573,7 @@
         </w:tc>
         <w:tc>
           <w:tcPr>
-            <w:tcW w:type="dxa" w:w="2268"/>
+            <w:tcW w:type="dxa" w:w="2154"/>
           </w:tcPr>
           <w:p>
             <w:pPr>
@@ -586,13 +586,13 @@
                 <w:color w:val="222D2A"/>
                 <w:sz w:val="20"/>
               </w:rPr>
-              <w:t>A5, landscape</w:t>
+              <w:t>2 copies</w:t>
             </w:r>
           </w:p>
         </w:tc>
         <w:tc>
           <w:tcPr>
-            <w:tcW w:type="dxa" w:w="3061"/>
+            <w:tcW w:type="dxa" w:w="4082"/>
           </w:tcPr>
           <w:p>
             <w:pPr>
@@ -605,7 +605,7 @@
                 <w:color w:val="222D2A"/>
                 <w:sz w:val="20"/>
               </w:rPr>
-              <w:t>Yes — see below</w:t>
+              <w:t>Cut in half, trim each</w:t>
             </w:r>
           </w:p>
         </w:tc>
@@ -613,7 +613,7 @@
       <w:tr>
         <w:tc>
           <w:tcPr>
-            <w:tcW w:type="dxa" w:w="2948"/>
+            <w:tcW w:type="dxa" w:w="2154"/>
           </w:tcPr>
           <w:p>
             <w:pPr>
@@ -632,7 +632,7 @@
         </w:tc>
         <w:tc>
           <w:tcPr>
-            <w:tcW w:type="dxa" w:w="1134"/>
+            <w:tcW w:type="dxa" w:w="1020"/>
           </w:tcPr>
           <w:p>
             <w:pPr>
@@ -645,13 +645,13 @@
                 <w:color w:val="222D2A"/>
                 <w:sz w:val="20"/>
               </w:rPr>
-              <w:t>26</w:t>
+              <w:t>7</w:t>
             </w:r>
           </w:p>
         </w:tc>
         <w:tc>
           <w:tcPr>
-            <w:tcW w:type="dxa" w:w="2268"/>
+            <w:tcW w:type="dxa" w:w="2154"/>
           </w:tcPr>
           <w:p>
             <w:pPr>
@@ -664,13 +664,13 @@
                 <w:color w:val="222D2A"/>
                 <w:sz w:val="20"/>
               </w:rPr>
-              <w:t>A6, portrait</w:t>
+              <w:t>26 place cards</w:t>
             </w:r>
           </w:p>
         </w:tc>
         <w:tc>
           <w:tcPr>
-            <w:tcW w:type="dxa" w:w="3061"/>
+            <w:tcW w:type="dxa" w:w="4082"/>
           </w:tcPr>
           <w:p>
             <w:pPr>
@@ -683,7 +683,7 @@
                 <w:color w:val="222D2A"/>
                 <w:sz w:val="20"/>
               </w:rPr>
-              <w:t>No — folded</w:t>
+              <w:t>Quarter each sheet, then fold</w:t>
             </w:r>
           </w:p>
         </w:tc>
@@ -702,12 +702,12 @@
           <w:color w:val="2C5D63"/>
           <w:sz w:val="21"/>
         </w:rPr>
-        <w:t>Designed for coloured paper — no background fill anywhere, so the stock shows through.</w:t>
+        <w:t>All A4. Designed for coloured paper — no background fill anywhere, so the stock shows through.</w:t>
       </w:r>
     </w:p>
     <w:p>
       <w:pPr>
-        <w:spacing w:before="180" w:after="120"/>
+        <w:spacing w:before="180" w:after="100"/>
         <w:jc w:val="left"/>
       </w:pPr>
       <w:r>
@@ -718,7 +718,7 @@
           <w:color w:val="2C5D63"/>
           <w:sz w:val="28"/>
         </w:rPr>
-        <w:t>The two that need cutting</w:t>
+        <w:t>Favours and Pegging — two to a sheet</w:t>
       </w:r>
     </w:p>
     <w:p>
@@ -734,7 +734,7 @@
           <w:color w:val="222D2A"/>
           <w:sz w:val="22"/>
         </w:rPr>
-        <w:t>These print onto A5 but end up smaller, so they sit properly inside the frame instead of being swallowed by its edge.</w:t>
+        <w:t>Each sheet carries two copies of the same sign. You only need one of each, so the second is a spare.</w:t>
       </w:r>
     </w:p>
     <w:p>
@@ -749,7 +749,7 @@
           <w:color w:val="222D2A"/>
           <w:sz w:val="22"/>
         </w:rPr>
-        <w:t xml:space="preserve">Cut along the line. </w:t>
+        <w:t xml:space="preserve">1.  </w:t>
       </w:r>
       <w:r>
         <w:rPr>
@@ -757,7 +757,7 @@
           <w:color w:val="222D2A"/>
           <w:sz w:val="22"/>
         </w:rPr>
-        <w:t>Follow the faint grey line printed near the edge. Cut along it — the line itself comes away with the offcut, so nothing shows on the finished card.</w:t>
+        <w:t>Cut the sheet in half, between the two copies.</w:t>
       </w:r>
     </w:p>
     <w:p>
@@ -772,7 +772,7 @@
           <w:color w:val="222D2A"/>
           <w:sz w:val="22"/>
         </w:rPr>
-        <w:t xml:space="preserve">Ignore the artwork beyond it. </w:t>
+        <w:t xml:space="preserve">2.  </w:t>
       </w:r>
       <w:r>
         <w:rPr>
@@ -780,7 +780,7 @@
           <w:color w:val="222D2A"/>
           <w:sz w:val="22"/>
         </w:rPr>
-        <w:t>The flowers deliberately carry on past the line. That is there so a slightly wandering cut still has colour running to the edge. You are not meant to cut around them.</w:t>
+        <w:t>On each half, cut along the faint grey line near the edge. The line comes away with the offcut, so nothing shows on the finished card.</w:t>
       </w:r>
     </w:p>
     <w:p>
@@ -795,7 +795,7 @@
           <w:color w:val="222D2A"/>
           <w:sz w:val="22"/>
         </w:rPr>
-        <w:t xml:space="preserve">Close enough is fine. </w:t>
+        <w:t xml:space="preserve">Note:  </w:t>
       </w:r>
       <w:r>
         <w:rPr>
@@ -803,69 +803,7 @@
           <w:color w:val="222D2A"/>
           <w:sz w:val="22"/>
         </w:rPr>
-        <w:t>Anywhere within a few millimetres of the line is fine. It does not need to be exact.</w:t>
-      </w:r>
-    </w:p>
-    <w:p>
-      <w:pPr>
-        <w:spacing w:before="80" w:after="60"/>
-        <w:jc w:val="left"/>
-      </w:pPr>
-      <w:r>
-        <w:rPr>
-          <w:rFonts w:ascii="Garamond" w:hAnsi="Garamond" w:cs="Garamond" w:eastAsia="Garamond"/>
-          <w:b/>
-          <w:i w:val="0"/>
-          <w:color w:val="222D2A"/>
-          <w:sz w:val="22"/>
-        </w:rPr>
-        <w:t>Finished sizes after cutting:</w:t>
-      </w:r>
-    </w:p>
-    <w:p>
-      <w:pPr>
-        <w:pStyle w:val="ListBullet"/>
-        <w:spacing w:after="40"/>
-      </w:pPr>
-      <w:r>
-        <w:rPr>
-          <w:rFonts w:ascii="Garamond" w:hAnsi="Garamond" w:cs="Garamond" w:eastAsia="Garamond"/>
-          <w:b/>
-          <w:color w:val="222D2A"/>
-          <w:sz w:val="22"/>
-        </w:rPr>
-        <w:t xml:space="preserve">Favours — </w:t>
-      </w:r>
-      <w:r>
-        <w:rPr>
-          <w:rFonts w:ascii="Garamond" w:hAnsi="Garamond" w:cs="Garamond" w:eastAsia="Garamond"/>
-          <w:color w:val="222D2A"/>
-          <w:sz w:val="22"/>
-        </w:rPr>
-        <w:t>130mm wide × 180mm tall</w:t>
-      </w:r>
-    </w:p>
-    <w:p>
-      <w:pPr>
-        <w:pStyle w:val="ListBullet"/>
-        <w:spacing w:after="40"/>
-      </w:pPr>
-      <w:r>
-        <w:rPr>
-          <w:rFonts w:ascii="Garamond" w:hAnsi="Garamond" w:cs="Garamond" w:eastAsia="Garamond"/>
-          <w:b/>
-          <w:color w:val="222D2A"/>
-          <w:sz w:val="22"/>
-        </w:rPr>
-        <w:t xml:space="preserve">Pegging — </w:t>
-      </w:r>
-      <w:r>
-        <w:rPr>
-          <w:rFonts w:ascii="Garamond" w:hAnsi="Garamond" w:cs="Garamond" w:eastAsia="Garamond"/>
-          <w:color w:val="222D2A"/>
-          <w:sz w:val="22"/>
-        </w:rPr>
-        <w:t>180mm wide × 130mm tall</w:t>
+        <w:t>The flowers deliberately carry on past that line, so a slightly wandering cut still has colour running to the edge. Do not try to cut around them.</w:t>
       </w:r>
     </w:p>
     <w:p>
@@ -881,12 +819,28 @@
           <w:color w:val="2C5D63"/>
           <w:sz w:val="21"/>
         </w:rPr>
-        <w:t>The A5 frames only show 118 × 169mm, so a 130 × 180mm card is held by the frame instead of dropping through. A4 frames show 198 × 289mm and take a full sheet, which is why those aren't cut.</w:t>
+        <w:t>Finished sizes: Favours 130 × 180mm, Pegging 180 × 130mm. Anywhere within a few millimetres of the line is fine.</w:t>
       </w:r>
     </w:p>
     <w:p>
       <w:pPr>
-        <w:spacing w:before="180" w:after="120"/>
+        <w:spacing w:before="40" w:after="40"/>
+        <w:jc w:val="left"/>
+      </w:pPr>
+      <w:r>
+        <w:rPr>
+          <w:rFonts w:ascii="Garamond" w:hAnsi="Garamond" w:cs="Garamond" w:eastAsia="Garamond"/>
+          <w:b w:val="0"/>
+          <w:i/>
+          <w:color w:val="2C5D63"/>
+          <w:sz w:val="21"/>
+        </w:rPr>
+        <w:t>The A5 frames only show 118 × 169mm, so a 130 × 180mm card is held by the frame instead of dropping through. The A4 frames show 198 × 289mm and take a full sheet, which is why those aren't cut.</w:t>
+      </w:r>
+    </w:p>
+    <w:p>
+      <w:pPr>
+        <w:spacing w:before="180" w:after="100"/>
         <w:jc w:val="left"/>
       </w:pPr>
       <w:r>
@@ -897,7 +851,7 @@
           <w:color w:val="2C5D63"/>
           <w:sz w:val="28"/>
         </w:rPr>
-        <w:t>The ones that don't need cutting</w:t>
+        <w:t>Table cards, Ring Blessing and Gifts</w:t>
       </w:r>
     </w:p>
     <w:p>
@@ -913,12 +867,12 @@
           <w:color w:val="222D2A"/>
           <w:sz w:val="22"/>
         </w:rPr>
-        <w:t>Table cards, Ring Blessing and Gifts print onto a full sheet and go straight into the frame. No line, nothing to trim.</w:t>
+        <w:t>One item per sheet, printed edge to edge. No line, nothing to trim — straight into the frame.</w:t>
       </w:r>
     </w:p>
     <w:p>
       <w:pPr>
-        <w:spacing w:before="180" w:after="120"/>
+        <w:spacing w:before="180" w:after="100"/>
         <w:jc w:val="left"/>
       </w:pPr>
       <w:r>
@@ -929,7 +883,7 @@
           <w:color w:val="2C5D63"/>
           <w:sz w:val="28"/>
         </w:rPr>
-        <w:t>Place cards</w:t>
+        <w:t>Place cards — four to a sheet</w:t>
       </w:r>
     </w:p>
     <w:p>
@@ -945,7 +899,7 @@
           <w:color w:val="222D2A"/>
           <w:sz w:val="22"/>
         </w:rPr>
-        <w:t>26 cards, one per person on the top table. Not framed — each folds in half across the middle so it stands up.</w:t>
+        <w:t>26 cards over 7 sheets, one per person on the top table. Not framed — each one folds into a little tent that stands on the table.</w:t>
       </w:r>
     </w:p>
     <w:p>
@@ -956,10 +910,19 @@
       <w:r>
         <w:rPr>
           <w:rFonts w:ascii="Garamond" w:hAnsi="Garamond" w:cs="Garamond" w:eastAsia="Garamond"/>
+          <w:b/>
           <w:color w:val="222D2A"/>
           <w:sz w:val="22"/>
         </w:rPr>
-        <w:t>The design sits on the bottom half of the sheet. The top half is blank on purpose — it becomes the back.</w:t>
+        <w:t xml:space="preserve">1.  </w:t>
+      </w:r>
+      <w:r>
+        <w:rPr>
+          <w:rFonts w:ascii="Garamond" w:hAnsi="Garamond" w:cs="Garamond" w:eastAsia="Garamond"/>
+          <w:color w:val="222D2A"/>
+          <w:sz w:val="22"/>
+        </w:rPr>
+        <w:t>Cut each sheet into quarters, following the faint lines down the middle.</w:t>
       </w:r>
     </w:p>
     <w:p>
@@ -970,10 +933,19 @@
       <w:r>
         <w:rPr>
           <w:rFonts w:ascii="Garamond" w:hAnsi="Garamond" w:cs="Garamond" w:eastAsia="Garamond"/>
+          <w:b/>
           <w:color w:val="222D2A"/>
           <w:sz w:val="22"/>
         </w:rPr>
-        <w:t>Fold across the middle, with the blank half folding backwards. Lining the corners up puts the fold in the right place.</w:t>
+        <w:t xml:space="preserve">2.  </w:t>
+      </w:r>
+      <w:r>
+        <w:rPr>
+          <w:rFonts w:ascii="Garamond" w:hAnsi="Garamond" w:cs="Garamond" w:eastAsia="Garamond"/>
+          <w:color w:val="222D2A"/>
+          <w:sz w:val="22"/>
+        </w:rPr>
+        <w:t>Fold each card in half across the middle, with the blank half folding backwards. Lining the corners up puts the fold in the right place.</w:t>
       </w:r>
     </w:p>
     <w:p>
@@ -984,10 +956,35 @@
       <w:r>
         <w:rPr>
           <w:rFonts w:ascii="Garamond" w:hAnsi="Garamond" w:cs="Garamond" w:eastAsia="Garamond"/>
+          <w:b/>
           <w:color w:val="222D2A"/>
           <w:sz w:val="22"/>
         </w:rPr>
-        <w:t>If your printer won't take A6, print four to an A4 sheet at 100% and cut into quarters — but check the first one measures 105mm across before doing the rest.</w:t>
+        <w:t xml:space="preserve">Note:  </w:t>
+      </w:r>
+      <w:r>
+        <w:rPr>
+          <w:rFonts w:ascii="Garamond" w:hAnsi="Garamond" w:cs="Garamond" w:eastAsia="Garamond"/>
+          <w:color w:val="222D2A"/>
+          <w:sz w:val="22"/>
+        </w:rPr>
+        <w:t>The blank half is meant to be blank — it becomes the back support once folded.</w:t>
+      </w:r>
+    </w:p>
+    <w:p>
+      <w:pPr>
+        <w:spacing w:before="60" w:after="0"/>
+        <w:jc w:val="left"/>
+      </w:pPr>
+      <w:r>
+        <w:rPr>
+          <w:rFonts w:ascii="Garamond" w:hAnsi="Garamond" w:cs="Garamond" w:eastAsia="Garamond"/>
+          <w:b w:val="0"/>
+          <w:i/>
+          <w:color w:val="2C5D63"/>
+          <w:sz w:val="21"/>
+        </w:rPr>
+        <w:t>The last sheet has two cards on it, not four.</w:t>
       </w:r>
     </w:p>
     <w:sectPr>

</xml_diff>

<commit_message>
One file for the whole print run
Adds print/ALL-PRINT-MATERIALS.docx - all six pieces, 20 pages, one print job.

Built natively as a six-section document rather than stitched together.
docxcompose was tried first and flattens everything into the first document's
section: every portrait piece came out on a landscape page carrying the table
cards' border. Each piece now gets its own Word section, which is what carries
page size, orientation, margins and header artwork, with the header explicitly
unlinked so it cannot inherit the previous one's border.

Landscape pieces are ordered first so the printer changes orientation once.

The instructions now key off page ranges rather than filenames, since there is
only one file to open.

Verified: 6 sections with the right orientations and margins, 6 headers, 12
border anchors, 30 text boxes, 9 name tables, 20 pages, and every corrected
name present with no Tzu remaining.

Co-Authored-By: Claude Opus 5 (1M context) <noreply@anthropic.com>
</commit_message>
<xml_diff>
--- a/print/printing-instructions.docx
+++ b/print/printing-instructions.docx
@@ -47,7 +47,7 @@
           <w:color w:val="2C5D63"/>
           <w:sz w:val="22"/>
         </w:rPr>
-        <w:t>Six documents, 20 sheets, all on A4. Some sheets carry more than one item and get cut up afterwards.</w:t>
+        <w:t>One file, 20 sheets, all on A4. Print the lot in one go. Some sheets carry more than one item and get cut up afterwards.</w:t>
       </w:r>
     </w:p>
     <w:p>
@@ -130,6 +130,22 @@
         <w:t>What to print</w:t>
       </w:r>
     </w:p>
+    <w:p>
+      <w:pPr>
+        <w:spacing w:before="0" w:after="100"/>
+        <w:jc w:val="left"/>
+      </w:pPr>
+      <w:r>
+        <w:rPr>
+          <w:rFonts w:ascii="Garamond" w:hAnsi="Garamond" w:cs="Garamond" w:eastAsia="Garamond"/>
+          <w:b w:val="0"/>
+          <w:i w:val="0"/>
+          <w:color w:val="222D2A"/>
+          <w:sz w:val="21"/>
+        </w:rPr>
+        <w:t>Everything is in one file: ALL-PRINT-MATERIALS.docx. Pages 1–10 are landscape and 11–20 portrait; the printer handles that itself, the paper goes in the same way throughout.</w:t>
+      </w:r>
+    </w:p>
     <w:tbl>
       <w:tblPr>
         <w:tblStyle w:val="TableGrid"/>
@@ -145,7 +161,7 @@
       <w:tr>
         <w:tc>
           <w:tcPr>
-            <w:tcW w:type="dxa" w:w="2154"/>
+            <w:tcW w:type="dxa" w:w="1134"/>
           </w:tcPr>
           <w:p>
             <w:pPr>
@@ -158,13 +174,13 @@
                 <w:color w:val="2C5D63"/>
                 <w:sz w:val="20"/>
               </w:rPr>
-              <w:t>Document</w:t>
+              <w:t>Pages</w:t>
             </w:r>
           </w:p>
         </w:tc>
         <w:tc>
           <w:tcPr>
-            <w:tcW w:type="dxa" w:w="1020"/>
+            <w:tcW w:type="dxa" w:w="1928"/>
           </w:tcPr>
           <w:p>
             <w:pPr>
@@ -177,7 +193,7 @@
                 <w:color w:val="2C5D63"/>
                 <w:sz w:val="20"/>
               </w:rPr>
-              <w:t>Sheets</w:t>
+              <w:t>What</w:t>
             </w:r>
           </w:p>
         </w:tc>
@@ -202,7 +218,7 @@
         </w:tc>
         <w:tc>
           <w:tcPr>
-            <w:tcW w:type="dxa" w:w="4082"/>
+            <w:tcW w:type="dxa" w:w="4195"/>
           </w:tcPr>
           <w:p>
             <w:pPr>
@@ -223,7 +239,7 @@
       <w:tr>
         <w:tc>
           <w:tcPr>
-            <w:tcW w:type="dxa" w:w="2154"/>
+            <w:tcW w:type="dxa" w:w="1134"/>
           </w:tcPr>
           <w:p>
             <w:pPr>
@@ -236,13 +252,13 @@
                 <w:color w:val="222D2A"/>
                 <w:sz w:val="20"/>
               </w:rPr>
-              <w:t>table-cards</w:t>
+              <w:t>1–9</w:t>
             </w:r>
           </w:p>
         </w:tc>
         <w:tc>
           <w:tcPr>
-            <w:tcW w:type="dxa" w:w="1020"/>
+            <w:tcW w:type="dxa" w:w="1928"/>
           </w:tcPr>
           <w:p>
             <w:pPr>
@@ -255,7 +271,7 @@
                 <w:color w:val="222D2A"/>
                 <w:sz w:val="20"/>
               </w:rPr>
-              <w:t>9</w:t>
+              <w:t>Table cards</w:t>
             </w:r>
           </w:p>
         </w:tc>
@@ -280,7 +296,7 @@
         </w:tc>
         <w:tc>
           <w:tcPr>
-            <w:tcW w:type="dxa" w:w="4082"/>
+            <w:tcW w:type="dxa" w:w="4195"/>
           </w:tcPr>
           <w:p>
             <w:pPr>
@@ -301,6 +317,44 @@
       <w:tr>
         <w:tc>
           <w:tcPr>
+            <w:tcW w:type="dxa" w:w="1134"/>
+          </w:tcPr>
+          <w:p>
+            <w:pPr>
+              <w:spacing w:before="40" w:after="40"/>
+            </w:pPr>
+            <w:r>
+              <w:rPr>
+                <w:rFonts w:ascii="Garamond" w:hAnsi="Garamond" w:cs="Garamond" w:eastAsia="Garamond"/>
+                <w:b w:val="0"/>
+                <w:color w:val="222D2A"/>
+                <w:sz w:val="20"/>
+              </w:rPr>
+              <w:t>10</w:t>
+            </w:r>
+          </w:p>
+        </w:tc>
+        <w:tc>
+          <w:tcPr>
+            <w:tcW w:type="dxa" w:w="1928"/>
+          </w:tcPr>
+          <w:p>
+            <w:pPr>
+              <w:spacing w:before="40" w:after="40"/>
+            </w:pPr>
+            <w:r>
+              <w:rPr>
+                <w:rFonts w:ascii="Garamond" w:hAnsi="Garamond" w:cs="Garamond" w:eastAsia="Garamond"/>
+                <w:b w:val="0"/>
+                <w:color w:val="222D2A"/>
+                <w:sz w:val="20"/>
+              </w:rPr>
+              <w:t>Favours</w:t>
+            </w:r>
+          </w:p>
+        </w:tc>
+        <w:tc>
+          <w:tcPr>
             <w:tcW w:type="dxa" w:w="2154"/>
           </w:tcPr>
           <w:p>
@@ -314,13 +368,13 @@
                 <w:color w:val="222D2A"/>
                 <w:sz w:val="20"/>
               </w:rPr>
-              <w:t>ring-blessing</w:t>
+              <w:t>2 copies</w:t>
             </w:r>
           </w:p>
         </w:tc>
         <w:tc>
           <w:tcPr>
-            <w:tcW w:type="dxa" w:w="1020"/>
+            <w:tcW w:type="dxa" w:w="4195"/>
           </w:tcPr>
           <w:p>
             <w:pPr>
@@ -333,7 +387,125 @@
                 <w:color w:val="222D2A"/>
                 <w:sz w:val="20"/>
               </w:rPr>
-              <w:t>1</w:t>
+              <w:t>Cut in half, trim each</w:t>
+            </w:r>
+          </w:p>
+        </w:tc>
+      </w:tr>
+      <w:tr>
+        <w:tc>
+          <w:tcPr>
+            <w:tcW w:type="dxa" w:w="1134"/>
+          </w:tcPr>
+          <w:p>
+            <w:pPr>
+              <w:spacing w:before="40" w:after="40"/>
+            </w:pPr>
+            <w:r>
+              <w:rPr>
+                <w:rFonts w:ascii="Garamond" w:hAnsi="Garamond" w:cs="Garamond" w:eastAsia="Garamond"/>
+                <w:b w:val="0"/>
+                <w:color w:val="222D2A"/>
+                <w:sz w:val="20"/>
+              </w:rPr>
+              <w:t>11–17</w:t>
+            </w:r>
+          </w:p>
+        </w:tc>
+        <w:tc>
+          <w:tcPr>
+            <w:tcW w:type="dxa" w:w="1928"/>
+          </w:tcPr>
+          <w:p>
+            <w:pPr>
+              <w:spacing w:before="40" w:after="40"/>
+            </w:pPr>
+            <w:r>
+              <w:rPr>
+                <w:rFonts w:ascii="Garamond" w:hAnsi="Garamond" w:cs="Garamond" w:eastAsia="Garamond"/>
+                <w:b w:val="0"/>
+                <w:color w:val="222D2A"/>
+                <w:sz w:val="20"/>
+              </w:rPr>
+              <w:t>Place cards</w:t>
+            </w:r>
+          </w:p>
+        </w:tc>
+        <w:tc>
+          <w:tcPr>
+            <w:tcW w:type="dxa" w:w="2154"/>
+          </w:tcPr>
+          <w:p>
+            <w:pPr>
+              <w:spacing w:before="40" w:after="40"/>
+            </w:pPr>
+            <w:r>
+              <w:rPr>
+                <w:rFonts w:ascii="Garamond" w:hAnsi="Garamond" w:cs="Garamond" w:eastAsia="Garamond"/>
+                <w:b w:val="0"/>
+                <w:color w:val="222D2A"/>
+                <w:sz w:val="20"/>
+              </w:rPr>
+              <w:t>26 place cards</w:t>
+            </w:r>
+          </w:p>
+        </w:tc>
+        <w:tc>
+          <w:tcPr>
+            <w:tcW w:type="dxa" w:w="4195"/>
+          </w:tcPr>
+          <w:p>
+            <w:pPr>
+              <w:spacing w:before="40" w:after="40"/>
+            </w:pPr>
+            <w:r>
+              <w:rPr>
+                <w:rFonts w:ascii="Garamond" w:hAnsi="Garamond" w:cs="Garamond" w:eastAsia="Garamond"/>
+                <w:b w:val="0"/>
+                <w:color w:val="222D2A"/>
+                <w:sz w:val="20"/>
+              </w:rPr>
+              <w:t>Quarter each sheet, then fold</w:t>
+            </w:r>
+          </w:p>
+        </w:tc>
+      </w:tr>
+      <w:tr>
+        <w:tc>
+          <w:tcPr>
+            <w:tcW w:type="dxa" w:w="1134"/>
+          </w:tcPr>
+          <w:p>
+            <w:pPr>
+              <w:spacing w:before="40" w:after="40"/>
+            </w:pPr>
+            <w:r>
+              <w:rPr>
+                <w:rFonts w:ascii="Garamond" w:hAnsi="Garamond" w:cs="Garamond" w:eastAsia="Garamond"/>
+                <w:b w:val="0"/>
+                <w:color w:val="222D2A"/>
+                <w:sz w:val="20"/>
+              </w:rPr>
+              <w:t>18</w:t>
+            </w:r>
+          </w:p>
+        </w:tc>
+        <w:tc>
+          <w:tcPr>
+            <w:tcW w:type="dxa" w:w="1928"/>
+          </w:tcPr>
+          <w:p>
+            <w:pPr>
+              <w:spacing w:before="40" w:after="40"/>
+            </w:pPr>
+            <w:r>
+              <w:rPr>
+                <w:rFonts w:ascii="Garamond" w:hAnsi="Garamond" w:cs="Garamond" w:eastAsia="Garamond"/>
+                <w:b w:val="0"/>
+                <w:color w:val="222D2A"/>
+                <w:sz w:val="20"/>
+              </w:rPr>
+              <w:t>Ring blessing</w:t>
             </w:r>
           </w:p>
         </w:tc>
@@ -358,7 +530,7 @@
         </w:tc>
         <w:tc>
           <w:tcPr>
-            <w:tcW w:type="dxa" w:w="4082"/>
+            <w:tcW w:type="dxa" w:w="4195"/>
           </w:tcPr>
           <w:p>
             <w:pPr>
@@ -379,7 +551,7 @@
       <w:tr>
         <w:tc>
           <w:tcPr>
-            <w:tcW w:type="dxa" w:w="2154"/>
+            <w:tcW w:type="dxa" w:w="1134"/>
           </w:tcPr>
           <w:p>
             <w:pPr>
@@ -392,13 +564,13 @@
                 <w:color w:val="222D2A"/>
                 <w:sz w:val="20"/>
               </w:rPr>
-              <w:t>gifts</w:t>
+              <w:t>19</w:t>
             </w:r>
           </w:p>
         </w:tc>
         <w:tc>
           <w:tcPr>
-            <w:tcW w:type="dxa" w:w="1020"/>
+            <w:tcW w:type="dxa" w:w="1928"/>
           </w:tcPr>
           <w:p>
             <w:pPr>
@@ -411,7 +583,7 @@
                 <w:color w:val="222D2A"/>
                 <w:sz w:val="20"/>
               </w:rPr>
-              <w:t>1</w:t>
+              <w:t>Gifts</w:t>
             </w:r>
           </w:p>
         </w:tc>
@@ -436,7 +608,7 @@
         </w:tc>
         <w:tc>
           <w:tcPr>
-            <w:tcW w:type="dxa" w:w="4082"/>
+            <w:tcW w:type="dxa" w:w="4195"/>
           </w:tcPr>
           <w:p>
             <w:pPr>
@@ -457,7 +629,7 @@
       <w:tr>
         <w:tc>
           <w:tcPr>
-            <w:tcW w:type="dxa" w:w="2154"/>
+            <w:tcW w:type="dxa" w:w="1134"/>
           </w:tcPr>
           <w:p>
             <w:pPr>
@@ -470,13 +642,13 @@
                 <w:color w:val="222D2A"/>
                 <w:sz w:val="20"/>
               </w:rPr>
-              <w:t>favours</w:t>
+              <w:t>20</w:t>
             </w:r>
           </w:p>
         </w:tc>
         <w:tc>
           <w:tcPr>
-            <w:tcW w:type="dxa" w:w="1020"/>
+            <w:tcW w:type="dxa" w:w="1928"/>
           </w:tcPr>
           <w:p>
             <w:pPr>
@@ -489,7 +661,7 @@
                 <w:color w:val="222D2A"/>
                 <w:sz w:val="20"/>
               </w:rPr>
-              <w:t>1</w:t>
+              <w:t>Pegging</w:t>
             </w:r>
           </w:p>
         </w:tc>
@@ -514,7 +686,7 @@
         </w:tc>
         <w:tc>
           <w:tcPr>
-            <w:tcW w:type="dxa" w:w="4082"/>
+            <w:tcW w:type="dxa" w:w="4195"/>
           </w:tcPr>
           <w:p>
             <w:pPr>
@@ -528,162 +700,6 @@
                 <w:sz w:val="20"/>
               </w:rPr>
               <w:t>Cut in half, trim each</w:t>
-            </w:r>
-          </w:p>
-        </w:tc>
-      </w:tr>
-      <w:tr>
-        <w:tc>
-          <w:tcPr>
-            <w:tcW w:type="dxa" w:w="2154"/>
-          </w:tcPr>
-          <w:p>
-            <w:pPr>
-              <w:spacing w:before="40" w:after="40"/>
-            </w:pPr>
-            <w:r>
-              <w:rPr>
-                <w:rFonts w:ascii="Garamond" w:hAnsi="Garamond" w:cs="Garamond" w:eastAsia="Garamond"/>
-                <w:b w:val="0"/>
-                <w:color w:val="222D2A"/>
-                <w:sz w:val="20"/>
-              </w:rPr>
-              <w:t>pegging</w:t>
-            </w:r>
-          </w:p>
-        </w:tc>
-        <w:tc>
-          <w:tcPr>
-            <w:tcW w:type="dxa" w:w="1020"/>
-          </w:tcPr>
-          <w:p>
-            <w:pPr>
-              <w:spacing w:before="40" w:after="40"/>
-            </w:pPr>
-            <w:r>
-              <w:rPr>
-                <w:rFonts w:ascii="Garamond" w:hAnsi="Garamond" w:cs="Garamond" w:eastAsia="Garamond"/>
-                <w:b w:val="0"/>
-                <w:color w:val="222D2A"/>
-                <w:sz w:val="20"/>
-              </w:rPr>
-              <w:t>1</w:t>
-            </w:r>
-          </w:p>
-        </w:tc>
-        <w:tc>
-          <w:tcPr>
-            <w:tcW w:type="dxa" w:w="2154"/>
-          </w:tcPr>
-          <w:p>
-            <w:pPr>
-              <w:spacing w:before="40" w:after="40"/>
-            </w:pPr>
-            <w:r>
-              <w:rPr>
-                <w:rFonts w:ascii="Garamond" w:hAnsi="Garamond" w:cs="Garamond" w:eastAsia="Garamond"/>
-                <w:b w:val="0"/>
-                <w:color w:val="222D2A"/>
-                <w:sz w:val="20"/>
-              </w:rPr>
-              <w:t>2 copies</w:t>
-            </w:r>
-          </w:p>
-        </w:tc>
-        <w:tc>
-          <w:tcPr>
-            <w:tcW w:type="dxa" w:w="4082"/>
-          </w:tcPr>
-          <w:p>
-            <w:pPr>
-              <w:spacing w:before="40" w:after="40"/>
-            </w:pPr>
-            <w:r>
-              <w:rPr>
-                <w:rFonts w:ascii="Garamond" w:hAnsi="Garamond" w:cs="Garamond" w:eastAsia="Garamond"/>
-                <w:b w:val="0"/>
-                <w:color w:val="222D2A"/>
-                <w:sz w:val="20"/>
-              </w:rPr>
-              <w:t>Cut in half, trim each</w:t>
-            </w:r>
-          </w:p>
-        </w:tc>
-      </w:tr>
-      <w:tr>
-        <w:tc>
-          <w:tcPr>
-            <w:tcW w:type="dxa" w:w="2154"/>
-          </w:tcPr>
-          <w:p>
-            <w:pPr>
-              <w:spacing w:before="40" w:after="40"/>
-            </w:pPr>
-            <w:r>
-              <w:rPr>
-                <w:rFonts w:ascii="Garamond" w:hAnsi="Garamond" w:cs="Garamond" w:eastAsia="Garamond"/>
-                <w:b w:val="0"/>
-                <w:color w:val="222D2A"/>
-                <w:sz w:val="20"/>
-              </w:rPr>
-              <w:t>place-cards</w:t>
-            </w:r>
-          </w:p>
-        </w:tc>
-        <w:tc>
-          <w:tcPr>
-            <w:tcW w:type="dxa" w:w="1020"/>
-          </w:tcPr>
-          <w:p>
-            <w:pPr>
-              <w:spacing w:before="40" w:after="40"/>
-            </w:pPr>
-            <w:r>
-              <w:rPr>
-                <w:rFonts w:ascii="Garamond" w:hAnsi="Garamond" w:cs="Garamond" w:eastAsia="Garamond"/>
-                <w:b w:val="0"/>
-                <w:color w:val="222D2A"/>
-                <w:sz w:val="20"/>
-              </w:rPr>
-              <w:t>7</w:t>
-            </w:r>
-          </w:p>
-        </w:tc>
-        <w:tc>
-          <w:tcPr>
-            <w:tcW w:type="dxa" w:w="2154"/>
-          </w:tcPr>
-          <w:p>
-            <w:pPr>
-              <w:spacing w:before="40" w:after="40"/>
-            </w:pPr>
-            <w:r>
-              <w:rPr>
-                <w:rFonts w:ascii="Garamond" w:hAnsi="Garamond" w:cs="Garamond" w:eastAsia="Garamond"/>
-                <w:b w:val="0"/>
-                <w:color w:val="222D2A"/>
-                <w:sz w:val="20"/>
-              </w:rPr>
-              <w:t>26 place cards</w:t>
-            </w:r>
-          </w:p>
-        </w:tc>
-        <w:tc>
-          <w:tcPr>
-            <w:tcW w:type="dxa" w:w="4082"/>
-          </w:tcPr>
-          <w:p>
-            <w:pPr>
-              <w:spacing w:before="40" w:after="40"/>
-            </w:pPr>
-            <w:r>
-              <w:rPr>
-                <w:rFonts w:ascii="Garamond" w:hAnsi="Garamond" w:cs="Garamond" w:eastAsia="Garamond"/>
-                <w:b w:val="0"/>
-                <w:color w:val="222D2A"/>
-                <w:sz w:val="20"/>
-              </w:rPr>
-              <w:t>Quarter each sheet, then fold</w:t>
             </w:r>
           </w:p>
         </w:tc>
@@ -718,7 +734,7 @@
           <w:color w:val="2C5D63"/>
           <w:sz w:val="28"/>
         </w:rPr>
-        <w:t>Favours and Pegging — two to a sheet</w:t>
+        <w:t>Favours and Pegging — pages 10 and 20</w:t>
       </w:r>
     </w:p>
     <w:p>
@@ -851,7 +867,7 @@
           <w:color w:val="2C5D63"/>
           <w:sz w:val="28"/>
         </w:rPr>
-        <w:t>Table cards, Ring Blessing and Gifts</w:t>
+        <w:t>Table cards, Ring Blessing and Gifts — pages 1–9, 18, 19</w:t>
       </w:r>
     </w:p>
     <w:p>
@@ -883,7 +899,7 @@
           <w:color w:val="2C5D63"/>
           <w:sz w:val="28"/>
         </w:rPr>
-        <w:t>Place cards — four to a sheet</w:t>
+        <w:t>Place cards — pages 11–17, four to a sheet</w:t>
       </w:r>
     </w:p>
     <w:p>

</xml_diff>